<commit_message>
Go Above and Beyond implementado: cartas Business/Student Partner v3 (direccion Cra 27 48-49, Student sin bolsa de empleo ni copy-paste roto, por rol) + CONDICIONES 1 pag (1.5 SMMLV+carta=Transformacion, resto=convenio 3.4, mejor beneficio, candado contrato IP) + articulo 3.5 al reglamento + fila empresas aliadas en el sprint; PDFs de JD originales quedan de referencia
Co-Authored-By: Claude Fable 5 <noreply@anthropic.com>
Claude-Session: https://claude.ai/code/session_018H7C5dx3NvDfXiv3CfhPMa
</commit_message>
<xml_diff>
--- a/documentos_operativos/politicas/REGLAMENTO_FONDO_Y_CARTA_IMPRIMIBLE.docx
+++ b/documentos_operativos/politicas/REGLAMENTO_FONDO_Y_CARTA_IMPRIMIBLE.docx
@@ -455,6 +455,18 @@
     </w:p>
     <w:p>
       <w:pPr>
+        <w:spacing w:after="80"/>
+      </w:pPr>
+      <w:r>
+        <w:rPr>
+          <w:b w:val="0"/>
+          <w:sz w:val="21"/>
+        </w:rPr>
+        <w:t>3.5 — Convenio Empresa Aliada (Go Above and Beyond): el colaborador de una empresa aliada que acredite ingresos hasta 1.5 SMMLV (desprendible de nómina) y carta de su empresa accede al perfil Transformación (techo 45%), dentro de los cupos trimestrales. Los demás colaboradores de la empresa aliada reciben el beneficio del numeral 3.4 (cuotas al porcentaje de contado). Los beneficios no se acumulan: se aplica el mejor.</w:t>
+      </w:r>
+    </w:p>
+    <w:p>
+      <w:pPr>
         <w:spacing w:after="100"/>
       </w:pPr>
       <w:r>

</xml_diff>

<commit_message>
B2B dos ofertas: A alianza sin costo (todos Transformacion como Cajasan + 3 Becas Empresa 45% a cuotas + libros) y B plan empresa a tarifa corporativa; reglamento del Fondo 3.4/3.5/3.6, convenio, propuesta, otrosi, tablero, condiciones, cuadro y dudas actualizados
Co-Authored-By: Claude Fable 5.1 <noreply@anthropic.com>
</commit_message>
<xml_diff>
--- a/documentos_operativos/politicas/REGLAMENTO_FONDO_Y_CARTA_IMPRIMIBLE.docx
+++ b/documentos_operativos/politicas/REGLAMENTO_FONDO_Y_CARTA_IMPRIMIBLE.docx
@@ -450,7 +450,7 @@
           <w:b w:val="0"/>
           <w:sz w:val="21"/>
         </w:rPr>
-        <w:t>3.4 — Convenio Cajasan: el aspirante que acredite afiliación vigente a Cajasan (carné o certificado) y pague a cuotas recibe el porcentaje de contado de su perfil. Este beneficio no modifica el techo del perfil ni se acumula con otros.</w:t>
+        <w:t>3.4 — Convenio Cajasan: el aspirante que acredite afiliación vigente a Cajasan (carné o certificado) accede a la columna Transformación (45% de contado / 36% a cuotas en el programa completo), sin exigir estrato. No se acumula con otros beneficios.</w:t>
       </w:r>
     </w:p>
     <w:p>
@@ -462,7 +462,19 @@
           <w:b w:val="0"/>
           <w:sz w:val="21"/>
         </w:rPr>
-        <w:t>3.5 — Convenio Empresa Aliada (Go Above and Beyond): el colaborador de una empresa aliada que acredite ingresos hasta 1.5 SMMLV (desprendible de nómina) y carta de su empresa accede al perfil Transformación (techo 45%), dentro de los cupos trimestrales. Los demás colaboradores de la empresa aliada reciben el beneficio del numeral 3.4 (cuotas al porcentaje de contado). Los beneficios no se acumulan: se aplica el mejor.</w:t>
+        <w:t>3.5 — Convenio Empresa Aliada (Heiiu Business Partner, iniciativa Go Above and Beyond): (a) todo colaborador de una empresa aliada que presente carta de postulación de su empresa accede a la columna Transformación, igual que el afiliado a Cajasan; (b) Beca [Empresa]: hasta TRES colaboradores por empresa y por ciclo, elegidos por la empresa, reciben el porcentaje de contado de la columna Transformación (45% en el programa completo) aunque paguen a cuotas, más los libros del programa y prioridad de cupo; si los tres cumplen las condiciones de permanencia, la empresa desbloquea hasta dos becas adicionales el ciclo siguiente; (c) los beneficios no se acumulan: se aplica el mejor; (d) las becas por empresa entran en el cupo trimestral de la columna Transformación.</w:t>
+      </w:r>
+    </w:p>
+    <w:p>
+      <w:pPr>
+        <w:spacing w:after="80"/>
+      </w:pPr>
+      <w:r>
+        <w:rPr>
+          <w:b w:val="0"/>
+          <w:sz w:val="21"/>
+        </w:rPr>
+        <w:t>3.6 — Tarifa corporativa (fuera del Fondo): cuando una empresa paga directamente el programa de sus colaboradores (mínimo tres cupos), no aplica beca personal: aplica la tarifa corporativa por volumen que fija gerencia, equivalente al valor de contado de la columna Transformación, con factura a la empresa y copago permitido. Lo negocia y firma gerencia.</w:t>
       </w:r>
     </w:p>
     <w:p>

</xml_diff>